<commit_message>
docs: allocate ten minutes for initial coloring and three for corrections
</commit_message>
<xml_diff>
--- a/邱梓钊 三年级《认识键盘》教学设计.docx
+++ b/邱梓钊 三年级《认识键盘》教学设计.docx
@@ -2265,7 +2265,7 @@
                 <w:sz w:val="24"/>
                 <w:highlight w:val="none"/>
               </w:rPr>
-              <w:t>3—11分钟</w:t>
+              <w:t>3—13分钟</w:t>
             </w:r>
           </w:p>
         </w:tc>
@@ -2693,7 +2693,7 @@
                 <w:sz w:val="24"/>
                 <w:highlight w:val="none"/>
               </w:rPr>
-              <w:t>11—14分钟</w:t>
+              <w:t>13—16分钟</w:t>
             </w:r>
           </w:p>
         </w:tc>
@@ -3121,7 +3121,7 @@
                 <w:sz w:val="24"/>
                 <w:highlight w:val="none"/>
               </w:rPr>
-              <w:t>14—19分钟</w:t>
+              <w:t>16—19分钟</w:t>
             </w:r>
           </w:p>
         </w:tc>

</xml_diff>

<commit_message>
docs: restore template school logo and school name on lesson cover
</commit_message>
<xml_diff>
--- a/邱梓钊 三年级《认识键盘》教学设计.docx
+++ b/邱梓钊 三年级《认识键盘》教学设计.docx
@@ -4,7 +4,59 @@
   <w:body>
     <w:p/>
     <w:p>
-      <w:r/>
+      <w:r>
+        <w:drawing>
+          <wp:anchor distT="0" distB="0" distL="114300" distR="114300" simplePos="0" relativeHeight="251659264" behindDoc="1" locked="0" layoutInCell="1" allowOverlap="1">
+            <wp:simplePos x="0" y="0"/>
+            <wp:positionH relativeFrom="column">
+              <wp:posOffset>2404745</wp:posOffset>
+            </wp:positionH>
+            <wp:positionV relativeFrom="paragraph">
+              <wp:posOffset>160020</wp:posOffset>
+            </wp:positionV>
+            <wp:extent cx="1519555" cy="1492885"/>
+            <wp:effectExtent l="0" t="0" r="4445" b="12065"/>
+            <wp:wrapNone/>
+            <wp:docPr id="7" name="图片 6"/>
+            <wp:cNvGraphicFramePr>
+              <a:graphicFrameLocks xmlns:a="http://schemas.openxmlformats.org/drawingml/2006/main" noChangeAspect="1"/>
+            </wp:cNvGraphicFramePr>
+            <a:graphic xmlns:a="http://schemas.openxmlformats.org/drawingml/2006/main">
+              <a:graphicData uri="http://schemas.openxmlformats.org/drawingml/2006/picture">
+                <pic:pic xmlns:pic="http://schemas.openxmlformats.org/drawingml/2006/picture">
+                  <pic:nvPicPr>
+                    <pic:cNvPr id="7" name="图片 6"/>
+                    <pic:cNvPicPr>
+                      <a:picLocks noChangeAspect="1"/>
+                    </pic:cNvPicPr>
+                  </pic:nvPicPr>
+                  <pic:blipFill>
+                    <a:blip r:embed="rIdSchoolLogo" cstate="print">
+                      <a:extLst>
+                        <a:ext uri="{28A0092B-C50C-407E-A947-70E740481C1C}">
+                          <a14:useLocalDpi xmlns:a14="http://schemas.microsoft.com/office/drawing/2010/main" val="0"/>
+                        </a:ext>
+                      </a:extLst>
+                    </a:blip>
+                    <a:stretch>
+                      <a:fillRect/>
+                    </a:stretch>
+                  </pic:blipFill>
+                  <pic:spPr>
+                    <a:xfrm>
+                      <a:off x="0" y="0"/>
+                      <a:ext cx="1519555" cy="1492885"/>
+                    </a:xfrm>
+                    <a:prstGeom prst="rect">
+                      <a:avLst/>
+                    </a:prstGeom>
+                  </pic:spPr>
+                </pic:pic>
+              </a:graphicData>
+            </a:graphic>
+          </wp:anchor>
+        </w:drawing>
+      </w:r>
     </w:p>
     <w:p/>
     <w:p/>
@@ -18,6 +70,8 @@
           <w:szCs w:val="160"/>
         </w:rPr>
       </w:pPr>
+      <w:bookmarkStart w:id="0" w:name="_GoBack"/>
+      <w:bookmarkEnd w:id="0"/>
     </w:p>
     <w:p>
       <w:pPr>
@@ -56,7 +110,7 @@
           <w:sz w:val="48"/>
           <w:szCs w:val="48"/>
         </w:rPr>
-        <w:t>2026年秋季学期</w:t>
+        <w:t>公明第</w:t>
       </w:r>
       <w:r>
         <w:rPr>
@@ -68,7 +122,7 @@
           <w:szCs w:val="48"/>
           <w:lang w:val="en-US" w:eastAsia="zh-CN"/>
         </w:rPr>
-        <w:t/>
+        <w:t>二</w:t>
       </w:r>
       <w:r>
         <w:rPr>
@@ -79,7 +133,7 @@
           <w:sz w:val="48"/>
           <w:szCs w:val="48"/>
         </w:rPr>
-        <w:t/>
+        <w:t>小学</w:t>
       </w:r>
       <w:r>
         <w:rPr>
@@ -91,7 +145,7 @@
           <w:szCs w:val="48"/>
           <w:lang w:val="en-US" w:eastAsia="zh-CN"/>
         </w:rPr>
-        <w:t/>
+        <w:t>2026年秋季学期</w:t>
       </w:r>
     </w:p>
     <w:p>
@@ -128,7 +182,7 @@
           <w:szCs w:val="48"/>
           <w:lang w:val="en-US" w:eastAsia="zh-CN"/>
         </w:rPr>
-        <w:t>新苗杯公开课</w:t>
+        <w:t>集备课</w:t>
       </w:r>
       <w:r>
         <w:rPr>
@@ -932,9 +986,9 @@
             <w:r>
               <w:rPr>
                 <w:rFonts w:hint="eastAsia" w:ascii="宋体" w:hAnsi="宋体" w:eastAsia="宋体" w:cs="宋体"/>
-                <w:color w:val="000000"/>
-                <w:highlight w:val="none"/>
-                <w:b/>
+                <w:b/>
+                <w:color w:val="000000"/>
+                <w:highlight w:val="none"/>
               </w:rPr>
               <w:t>教学准备</w:t>
             </w:r>
@@ -1348,7 +1402,7 @@
           </w:tcPr>
           <w:p>
             <w:pPr>
-              <w:keepNext w:val="1"/>
+              <w:keepNext/>
               <w:keepLines w:val="0"/>
               <w:numPr>
                 <w:ilvl w:val="0"/>
@@ -1381,7 +1435,7 @@
           </w:p>
           <w:p>
             <w:pPr>
-              <w:keepNext w:val="1"/>
+              <w:keepNext/>
               <w:keepLines w:val="0"/>
               <w:numPr>
                 <w:ilvl w:val="0"/>
@@ -1432,7 +1486,7 @@
           </w:tcPr>
           <w:p>
             <w:pPr>
-              <w:keepNext w:val="1"/>
+              <w:keepNext/>
               <w:keepLines w:val="0"/>
               <w:numPr>
                 <w:ilvl w:val="0"/>
@@ -1463,7 +1517,7 @@
           </w:p>
           <w:p>
             <w:pPr>
-              <w:keepNext w:val="1"/>
+              <w:keepNext/>
               <w:keepLines w:val="0"/>
               <w:numPr>
                 <w:ilvl w:val="0"/>
@@ -1494,7 +1548,7 @@
           </w:p>
           <w:p>
             <w:pPr>
-              <w:keepNext w:val="1"/>
+              <w:keepNext/>
               <w:keepLines w:val="0"/>
               <w:numPr>
                 <w:ilvl w:val="0"/>
@@ -1544,7 +1598,7 @@
           </w:tcPr>
           <w:p>
             <w:pPr>
-              <w:keepNext w:val="1"/>
+              <w:keepNext/>
               <w:keepLines w:val="0"/>
               <w:numPr>
                 <w:ilvl w:val="0"/>
@@ -1595,7 +1649,7 @@
           </w:tcPr>
           <w:p>
             <w:pPr>
-              <w:keepNext w:val="1"/>
+              <w:keepNext/>
               <w:keepLines w:val="0"/>
               <w:suppressLineNumbers w:val="0"/>
               <w:spacing w:before="0" w:beforeAutospacing="0" w:after="0" w:afterAutospacing="0" w:line="240" w:lineRule="auto"/>
@@ -1608,7 +1662,9 @@
               </w:rPr>
             </w:pPr>
             <w:r>
-              <w:rPr/>
+              <w:rPr>
+                <w:rFonts w:hint="default"/>
+              </w:rPr>
               <w:t>复习迁移；实物观察。</w:t>
             </w:r>
           </w:p>
@@ -1776,7 +1832,7 @@
           </w:tcPr>
           <w:p>
             <w:pPr>
-              <w:keepNext w:val="1"/>
+              <w:keepNext/>
               <w:keepLines w:val="0"/>
               <w:numPr>
                 <w:ilvl w:val="0"/>
@@ -1809,7 +1865,7 @@
           </w:p>
           <w:p>
             <w:pPr>
-              <w:keepNext w:val="1"/>
+              <w:keepNext/>
               <w:keepLines w:val="0"/>
               <w:numPr>
                 <w:ilvl w:val="0"/>
@@ -1860,7 +1916,7 @@
           </w:tcPr>
           <w:p>
             <w:pPr>
-              <w:keepNext w:val="1"/>
+              <w:keepNext/>
               <w:keepLines w:val="0"/>
               <w:numPr>
                 <w:ilvl w:val="0"/>
@@ -1891,7 +1947,7 @@
           </w:p>
           <w:p>
             <w:pPr>
-              <w:keepNext w:val="1"/>
+              <w:keepNext/>
               <w:keepLines w:val="0"/>
               <w:numPr>
                 <w:ilvl w:val="0"/>
@@ -1922,7 +1978,7 @@
           </w:p>
           <w:p>
             <w:pPr>
-              <w:keepNext w:val="1"/>
+              <w:keepNext/>
               <w:keepLines w:val="0"/>
               <w:numPr>
                 <w:ilvl w:val="0"/>
@@ -1972,7 +2028,7 @@
           </w:tcPr>
           <w:p>
             <w:pPr>
-              <w:keepNext w:val="1"/>
+              <w:keepNext/>
               <w:keepLines w:val="0"/>
               <w:numPr>
                 <w:ilvl w:val="0"/>
@@ -2023,7 +2079,7 @@
           </w:tcPr>
           <w:p>
             <w:pPr>
-              <w:keepNext w:val="1"/>
+              <w:keepNext/>
               <w:keepLines w:val="0"/>
               <w:suppressLineNumbers w:val="0"/>
               <w:spacing w:before="0" w:beforeAutospacing="0" w:after="0" w:afterAutospacing="0" w:line="240" w:lineRule="auto"/>
@@ -2036,7 +2092,9 @@
               </w:rPr>
             </w:pPr>
             <w:r>
-              <w:rPr/>
+              <w:rPr>
+                <w:rFonts w:hint="default"/>
+              </w:rPr>
               <w:t>颜色图例常驻；操作示范。</w:t>
             </w:r>
           </w:p>
@@ -2204,7 +2262,7 @@
           </w:tcPr>
           <w:p>
             <w:pPr>
-              <w:keepNext w:val="1"/>
+              <w:keepNext/>
               <w:keepLines w:val="0"/>
               <w:numPr>
                 <w:ilvl w:val="0"/>
@@ -2237,7 +2295,7 @@
           </w:p>
           <w:p>
             <w:pPr>
-              <w:keepNext w:val="1"/>
+              <w:keepNext/>
               <w:keepLines w:val="0"/>
               <w:numPr>
                 <w:ilvl w:val="0"/>
@@ -2288,7 +2346,7 @@
           </w:tcPr>
           <w:p>
             <w:pPr>
-              <w:keepNext w:val="1"/>
+              <w:keepNext/>
               <w:keepLines w:val="0"/>
               <w:numPr>
                 <w:ilvl w:val="0"/>
@@ -2319,7 +2377,7 @@
           </w:p>
           <w:p>
             <w:pPr>
-              <w:keepNext w:val="1"/>
+              <w:keepNext/>
               <w:keepLines w:val="0"/>
               <w:numPr>
                 <w:ilvl w:val="0"/>
@@ -2350,7 +2408,7 @@
           </w:p>
           <w:p>
             <w:pPr>
-              <w:keepNext w:val="1"/>
+              <w:keepNext/>
               <w:keepLines w:val="0"/>
               <w:numPr>
                 <w:ilvl w:val="0"/>
@@ -2400,7 +2458,7 @@
           </w:tcPr>
           <w:p>
             <w:pPr>
-              <w:keepNext w:val="1"/>
+              <w:keepNext/>
               <w:keepLines w:val="0"/>
               <w:numPr>
                 <w:ilvl w:val="0"/>
@@ -2451,7 +2509,7 @@
           </w:tcPr>
           <w:p>
             <w:pPr>
-              <w:keepNext w:val="1"/>
+              <w:keepNext/>
               <w:keepLines w:val="0"/>
               <w:suppressLineNumbers w:val="0"/>
               <w:spacing w:before="0" w:beforeAutospacing="0" w:after="0" w:afterAutospacing="0" w:line="240" w:lineRule="auto"/>
@@ -2464,7 +2522,9 @@
               </w:rPr>
             </w:pPr>
             <w:r>
-              <w:rPr/>
+              <w:rPr>
+                <w:rFonts w:hint="default"/>
+              </w:rPr>
               <w:t>先学后教；实时混色反馈。</w:t>
             </w:r>
           </w:p>
@@ -2632,7 +2692,7 @@
           </w:tcPr>
           <w:p>
             <w:pPr>
-              <w:keepNext w:val="1"/>
+              <w:keepNext/>
               <w:keepLines w:val="0"/>
               <w:numPr>
                 <w:ilvl w:val="0"/>
@@ -2665,7 +2725,7 @@
           </w:p>
           <w:p>
             <w:pPr>
-              <w:keepNext w:val="1"/>
+              <w:keepNext/>
               <w:keepLines w:val="0"/>
               <w:numPr>
                 <w:ilvl w:val="0"/>
@@ -2716,7 +2776,7 @@
           </w:tcPr>
           <w:p>
             <w:pPr>
-              <w:keepNext w:val="1"/>
+              <w:keepNext/>
               <w:keepLines w:val="0"/>
               <w:numPr>
                 <w:ilvl w:val="0"/>
@@ -2747,7 +2807,7 @@
           </w:p>
           <w:p>
             <w:pPr>
-              <w:keepNext w:val="1"/>
+              <w:keepNext/>
               <w:keepLines w:val="0"/>
               <w:numPr>
                 <w:ilvl w:val="0"/>
@@ -2778,7 +2838,7 @@
           </w:p>
           <w:p>
             <w:pPr>
-              <w:keepNext w:val="1"/>
+              <w:keepNext/>
               <w:keepLines w:val="0"/>
               <w:numPr>
                 <w:ilvl w:val="0"/>
@@ -2828,7 +2888,7 @@
           </w:tcPr>
           <w:p>
             <w:pPr>
-              <w:keepNext w:val="1"/>
+              <w:keepNext/>
               <w:keepLines w:val="0"/>
               <w:numPr>
                 <w:ilvl w:val="0"/>
@@ -2879,7 +2939,7 @@
           </w:tcPr>
           <w:p>
             <w:pPr>
-              <w:keepNext w:val="1"/>
+              <w:keepNext/>
               <w:keepLines w:val="0"/>
               <w:suppressLineNumbers w:val="0"/>
               <w:spacing w:before="0" w:beforeAutospacing="0" w:after="0" w:afterAutospacing="0" w:line="240" w:lineRule="auto"/>
@@ -2892,7 +2952,9 @@
               </w:rPr>
             </w:pPr>
             <w:r>
-              <w:rPr/>
+              <w:rPr>
+                <w:rFonts w:hint="default"/>
+              </w:rPr>
               <w:t>以错促学；图物对照。</w:t>
             </w:r>
           </w:p>
@@ -3060,7 +3122,7 @@
           </w:tcPr>
           <w:p>
             <w:pPr>
-              <w:keepNext w:val="1"/>
+              <w:keepNext/>
               <w:keepLines w:val="0"/>
               <w:numPr>
                 <w:ilvl w:val="0"/>
@@ -3093,7 +3155,7 @@
           </w:p>
           <w:p>
             <w:pPr>
-              <w:keepNext w:val="1"/>
+              <w:keepNext/>
               <w:keepLines w:val="0"/>
               <w:numPr>
                 <w:ilvl w:val="0"/>
@@ -3144,7 +3206,7 @@
           </w:tcPr>
           <w:p>
             <w:pPr>
-              <w:keepNext w:val="1"/>
+              <w:keepNext/>
               <w:keepLines w:val="0"/>
               <w:numPr>
                 <w:ilvl w:val="0"/>
@@ -3175,7 +3237,7 @@
           </w:p>
           <w:p>
             <w:pPr>
-              <w:keepNext w:val="1"/>
+              <w:keepNext/>
               <w:keepLines w:val="0"/>
               <w:numPr>
                 <w:ilvl w:val="0"/>
@@ -3206,7 +3268,7 @@
           </w:p>
           <w:p>
             <w:pPr>
-              <w:keepNext w:val="1"/>
+              <w:keepNext/>
               <w:keepLines w:val="0"/>
               <w:numPr>
                 <w:ilvl w:val="0"/>
@@ -3256,7 +3318,7 @@
           </w:tcPr>
           <w:p>
             <w:pPr>
-              <w:keepNext w:val="1"/>
+              <w:keepNext/>
               <w:keepLines w:val="0"/>
               <w:numPr>
                 <w:ilvl w:val="0"/>
@@ -3307,7 +3369,7 @@
           </w:tcPr>
           <w:p>
             <w:pPr>
-              <w:keepNext w:val="1"/>
+              <w:keepNext/>
               <w:keepLines w:val="0"/>
               <w:suppressLineNumbers w:val="0"/>
               <w:spacing w:before="0" w:beforeAutospacing="0" w:after="0" w:afterAutospacing="0" w:line="240" w:lineRule="auto"/>
@@ -3320,7 +3382,9 @@
               </w:rPr>
             </w:pPr>
             <w:r>
-              <w:rPr/>
+              <w:rPr>
+                <w:rFonts w:hint="default"/>
+              </w:rPr>
               <w:t>二次尝试；前后对比；同伴指认。</w:t>
             </w:r>
           </w:p>
@@ -3488,7 +3552,7 @@
           </w:tcPr>
           <w:p>
             <w:pPr>
-              <w:keepNext w:val="1"/>
+              <w:keepNext/>
               <w:keepLines w:val="0"/>
               <w:numPr>
                 <w:ilvl w:val="0"/>
@@ -3521,7 +3585,7 @@
           </w:p>
           <w:p>
             <w:pPr>
-              <w:keepNext w:val="1"/>
+              <w:keepNext/>
               <w:keepLines w:val="0"/>
               <w:numPr>
                 <w:ilvl w:val="0"/>
@@ -3572,7 +3636,7 @@
           </w:tcPr>
           <w:p>
             <w:pPr>
-              <w:keepNext w:val="1"/>
+              <w:keepNext/>
               <w:keepLines w:val="0"/>
               <w:numPr>
                 <w:ilvl w:val="0"/>
@@ -3603,7 +3667,7 @@
           </w:p>
           <w:p>
             <w:pPr>
-              <w:keepNext w:val="1"/>
+              <w:keepNext/>
               <w:keepLines w:val="0"/>
               <w:numPr>
                 <w:ilvl w:val="0"/>
@@ -3634,7 +3698,7 @@
           </w:p>
           <w:p>
             <w:pPr>
-              <w:keepNext w:val="1"/>
+              <w:keepNext/>
               <w:keepLines w:val="0"/>
               <w:numPr>
                 <w:ilvl w:val="0"/>
@@ -3684,7 +3748,7 @@
           </w:tcPr>
           <w:p>
             <w:pPr>
-              <w:keepNext w:val="1"/>
+              <w:keepNext/>
               <w:keepLines w:val="0"/>
               <w:numPr>
                 <w:ilvl w:val="0"/>
@@ -3735,7 +3799,7 @@
           </w:tcPr>
           <w:p>
             <w:pPr>
-              <w:keepNext w:val="1"/>
+              <w:keepNext/>
               <w:keepLines w:val="0"/>
               <w:suppressLineNumbers w:val="0"/>
               <w:spacing w:before="0" w:beforeAutospacing="0" w:after="0" w:afterAutospacing="0" w:line="240" w:lineRule="auto"/>
@@ -3748,7 +3812,9 @@
               </w:rPr>
             </w:pPr>
             <w:r>
-              <w:rPr/>
+              <w:rPr>
+                <w:rFonts w:hint="default"/>
+              </w:rPr>
               <w:t>一次示范；低门槛起步。</w:t>
             </w:r>
           </w:p>
@@ -3916,7 +3982,7 @@
           </w:tcPr>
           <w:p>
             <w:pPr>
-              <w:keepNext w:val="1"/>
+              <w:keepNext/>
               <w:keepLines w:val="0"/>
               <w:numPr>
                 <w:ilvl w:val="0"/>
@@ -3949,7 +4015,7 @@
           </w:p>
           <w:p>
             <w:pPr>
-              <w:keepNext w:val="1"/>
+              <w:keepNext/>
               <w:keepLines w:val="0"/>
               <w:numPr>
                 <w:ilvl w:val="0"/>
@@ -4000,7 +4066,7 @@
           </w:tcPr>
           <w:p>
             <w:pPr>
-              <w:keepNext w:val="1"/>
+              <w:keepNext/>
               <w:keepLines w:val="0"/>
               <w:numPr>
                 <w:ilvl w:val="0"/>
@@ -4031,7 +4097,7 @@
           </w:p>
           <w:p>
             <w:pPr>
-              <w:keepNext w:val="1"/>
+              <w:keepNext/>
               <w:keepLines w:val="0"/>
               <w:numPr>
                 <w:ilvl w:val="0"/>
@@ -4062,7 +4128,7 @@
           </w:p>
           <w:p>
             <w:pPr>
-              <w:keepNext w:val="1"/>
+              <w:keepNext/>
               <w:keepLines w:val="0"/>
               <w:numPr>
                 <w:ilvl w:val="0"/>
@@ -4093,7 +4159,7 @@
           </w:p>
           <w:p>
             <w:pPr>
-              <w:keepNext w:val="1"/>
+              <w:keepNext/>
               <w:keepLines w:val="0"/>
               <w:numPr>
                 <w:ilvl w:val="0"/>
@@ -4143,7 +4209,7 @@
           </w:tcPr>
           <w:p>
             <w:pPr>
-              <w:keepNext w:val="1"/>
+              <w:keepNext/>
               <w:keepLines w:val="0"/>
               <w:numPr>
                 <w:ilvl w:val="0"/>
@@ -4194,7 +4260,7 @@
           </w:tcPr>
           <w:p>
             <w:pPr>
-              <w:keepNext w:val="1"/>
+              <w:keepNext/>
               <w:keepLines w:val="0"/>
               <w:suppressLineNumbers w:val="0"/>
               <w:spacing w:before="0" w:beforeAutospacing="0" w:after="0" w:afterAutospacing="0" w:line="240" w:lineRule="auto"/>
@@ -4207,7 +4273,9 @@
               </w:rPr>
             </w:pPr>
             <w:r>
-              <w:rPr/>
+              <w:rPr>
+                <w:rFonts w:hint="default"/>
+              </w:rPr>
               <w:t>色卡激励；分层练习；进度反馈。</w:t>
             </w:r>
           </w:p>
@@ -4375,7 +4443,7 @@
           </w:tcPr>
           <w:p>
             <w:pPr>
-              <w:keepNext w:val="1"/>
+              <w:keepNext/>
               <w:keepLines w:val="0"/>
               <w:numPr>
                 <w:ilvl w:val="0"/>
@@ -4408,7 +4476,7 @@
           </w:p>
           <w:p>
             <w:pPr>
-              <w:keepNext w:val="1"/>
+              <w:keepNext/>
               <w:keepLines w:val="0"/>
               <w:numPr>
                 <w:ilvl w:val="0"/>
@@ -4459,7 +4527,7 @@
           </w:tcPr>
           <w:p>
             <w:pPr>
-              <w:keepNext w:val="1"/>
+              <w:keepNext/>
               <w:keepLines w:val="0"/>
               <w:numPr>
                 <w:ilvl w:val="0"/>
@@ -4490,7 +4558,7 @@
           </w:p>
           <w:p>
             <w:pPr>
-              <w:keepNext w:val="1"/>
+              <w:keepNext/>
               <w:keepLines w:val="0"/>
               <w:numPr>
                 <w:ilvl w:val="0"/>
@@ -4521,7 +4589,7 @@
           </w:p>
           <w:p>
             <w:pPr>
-              <w:keepNext w:val="1"/>
+              <w:keepNext/>
               <w:keepLines w:val="0"/>
               <w:numPr>
                 <w:ilvl w:val="0"/>
@@ -4571,7 +4639,7 @@
           </w:tcPr>
           <w:p>
             <w:pPr>
-              <w:keepNext w:val="1"/>
+              <w:keepNext/>
               <w:keepLines w:val="0"/>
               <w:numPr>
                 <w:ilvl w:val="0"/>
@@ -4622,7 +4690,7 @@
           </w:tcPr>
           <w:p>
             <w:pPr>
-              <w:keepNext w:val="1"/>
+              <w:keepNext/>
               <w:keepLines w:val="0"/>
               <w:suppressLineNumbers w:val="0"/>
               <w:spacing w:before="0" w:beforeAutospacing="0" w:after="0" w:afterAutospacing="0" w:line="240" w:lineRule="auto"/>
@@ -4635,7 +4703,9 @@
               </w:rPr>
             </w:pPr>
             <w:r>
-              <w:rPr/>
+              <w:rPr>
+                <w:rFonts w:hint="default"/>
+              </w:rPr>
               <w:t>口头回顾；结合操作评价。</w:t>
             </w:r>
           </w:p>
@@ -5051,23 +5121,39 @@
               <w:suppressLineNumbers w:val="0"/>
               <w:spacing w:before="0" w:beforeAutospacing="0" w:after="0" w:afterAutospacing="0" w:line="240" w:lineRule="auto"/>
               <w:ind w:left="0" w:right="0"/>
+              <w:jc w:val="center"/>
               <w:rPr>
                 <w:rFonts w:hint="eastAsia" w:ascii="宋体" w:hAnsi="宋体" w:eastAsia="宋体" w:cs="宋体"/>
                 <w:sz w:val="24"/>
                 <w:highlight w:val="none"/>
                 <w:lang w:eastAsia="zh-CN"/>
               </w:rPr>
+            </w:pPr>
+            <w:r>
+              <w:rPr>
+                <w:rFonts w:hint="eastAsia" w:ascii="宋体" w:hAnsi="宋体" w:eastAsia="宋体" w:cs="宋体"/>
+                <w:sz w:val="24"/>
+                <w:highlight w:val="none"/>
+                <w:lang w:eastAsia="zh-CN"/>
+              </w:rPr>
+              <w:t>认识键盘</w:t>
+            </w:r>
+          </w:p>
+          <w:p>
+            <w:pPr>
+              <w:keepNext w:val="0"/>
+              <w:keepLines w:val="0"/>
+              <w:suppressLineNumbers w:val="0"/>
+              <w:spacing w:before="0" w:beforeAutospacing="0" w:after="0" w:afterAutospacing="0" w:line="240" w:lineRule="auto"/>
+              <w:ind w:left="0" w:right="0"/>
               <w:jc w:val="center"/>
-            </w:pPr>
-            <w:r>
               <w:rPr>
                 <w:rFonts w:hint="eastAsia" w:ascii="宋体" w:hAnsi="宋体" w:eastAsia="宋体" w:cs="宋体"/>
                 <w:sz w:val="24"/>
                 <w:highlight w:val="none"/>
                 <w:lang w:eastAsia="zh-CN"/>
               </w:rPr>
-              <w:t>认识键盘</w:t>
-            </w:r>
+            </w:pPr>
           </w:p>
           <w:p>
             <w:pPr>
@@ -5076,22 +5162,47 @@
               <w:suppressLineNumbers w:val="0"/>
               <w:spacing w:before="0" w:beforeAutospacing="0" w:after="0" w:afterAutospacing="0" w:line="240" w:lineRule="auto"/>
               <w:ind w:left="0" w:right="0"/>
+              <w:jc w:val="center"/>
               <w:rPr>
                 <w:rFonts w:hint="eastAsia" w:ascii="宋体" w:hAnsi="宋体" w:eastAsia="宋体" w:cs="宋体"/>
                 <w:sz w:val="24"/>
                 <w:highlight w:val="none"/>
                 <w:lang w:eastAsia="zh-CN"/>
               </w:rPr>
+            </w:pPr>
+            <w:r>
+              <w:rPr>
+                <w:rFonts w:hint="eastAsia" w:ascii="宋体" w:hAnsi="宋体" w:eastAsia="宋体" w:cs="宋体"/>
+                <w:sz w:val="24"/>
+                <w:highlight w:val="none"/>
+                <w:lang w:eastAsia="zh-CN"/>
+              </w:rPr>
+              <w:t>主键盘区　功能键区　编辑键区</w:t>
+            </w:r>
+          </w:p>
+          <w:p>
+            <w:pPr>
+              <w:keepNext w:val="0"/>
+              <w:keepLines w:val="0"/>
+              <w:suppressLineNumbers w:val="0"/>
+              <w:spacing w:before="0" w:beforeAutospacing="0" w:after="0" w:afterAutospacing="0" w:line="240" w:lineRule="auto"/>
+              <w:ind w:left="0" w:right="0"/>
               <w:jc w:val="center"/>
-            </w:pPr>
-            <w:r>
               <w:rPr>
                 <w:rFonts w:hint="eastAsia" w:ascii="宋体" w:hAnsi="宋体" w:eastAsia="宋体" w:cs="宋体"/>
                 <w:sz w:val="24"/>
                 <w:highlight w:val="none"/>
                 <w:lang w:eastAsia="zh-CN"/>
               </w:rPr>
-              <w:t>键盘——输入设备</w:t>
+            </w:pPr>
+            <w:r>
+              <w:rPr>
+                <w:rFonts w:hint="eastAsia" w:ascii="宋体" w:hAnsi="宋体" w:eastAsia="宋体" w:cs="宋体"/>
+                <w:sz w:val="24"/>
+                <w:highlight w:val="none"/>
+                <w:lang w:eastAsia="zh-CN"/>
+              </w:rPr>
+              <w:t>小键盘区　指示灯区</w:t>
             </w:r>
           </w:p>
           <w:p>
@@ -5101,98 +5212,39 @@
               <w:suppressLineNumbers w:val="0"/>
               <w:spacing w:before="0" w:beforeAutospacing="0" w:after="0" w:afterAutospacing="0" w:line="240" w:lineRule="auto"/>
               <w:ind w:left="0" w:right="0"/>
+              <w:jc w:val="center"/>
               <w:rPr>
                 <w:rFonts w:hint="eastAsia" w:ascii="宋体" w:hAnsi="宋体" w:eastAsia="宋体" w:cs="宋体"/>
                 <w:sz w:val="24"/>
                 <w:highlight w:val="none"/>
                 <w:lang w:eastAsia="zh-CN"/>
               </w:rPr>
+            </w:pPr>
+            <w:r>
+              <w:rPr>
+                <w:rFonts w:hint="eastAsia" w:ascii="宋体" w:hAnsi="宋体" w:eastAsia="宋体" w:cs="宋体"/>
+                <w:sz w:val="24"/>
+                <w:highlight w:val="none"/>
+                <w:lang w:eastAsia="zh-CN"/>
+              </w:rPr>
+              <w:t>主键盘区：输入字母和数字</w:t>
+            </w:r>
+          </w:p>
+          <w:p>
+            <w:pPr>
+              <w:keepNext w:val="0"/>
+              <w:keepLines w:val="0"/>
+              <w:suppressLineNumbers w:val="0"/>
+              <w:spacing w:before="0" w:beforeAutospacing="0" w:after="0" w:afterAutospacing="0" w:line="240" w:lineRule="auto"/>
+              <w:ind w:left="0" w:right="0"/>
               <w:jc w:val="center"/>
-            </w:pPr>
-            <w:r>
               <w:rPr>
                 <w:rFonts w:hint="eastAsia" w:ascii="宋体" w:hAnsi="宋体" w:eastAsia="宋体" w:cs="宋体"/>
                 <w:sz w:val="24"/>
                 <w:highlight w:val="none"/>
                 <w:lang w:eastAsia="zh-CN"/>
               </w:rPr>
-              <w:t>主键盘区（红）　功能键区（黄）　编辑键区（蓝）</w:t>
-            </w:r>
-          </w:p>
-          <w:p>
-            <w:pPr>
-              <w:keepNext w:val="0"/>
-              <w:keepLines w:val="0"/>
-              <w:suppressLineNumbers w:val="0"/>
-              <w:spacing w:before="0" w:beforeAutospacing="0" w:after="0" w:afterAutospacing="0" w:line="240" w:lineRule="auto"/>
-              <w:ind w:left="0" w:right="0"/>
-              <w:rPr>
-                <w:rFonts w:hint="eastAsia" w:ascii="宋体" w:hAnsi="宋体" w:eastAsia="宋体" w:cs="宋体"/>
-                <w:sz w:val="24"/>
-                <w:highlight w:val="none"/>
-                <w:lang w:eastAsia="zh-CN"/>
-              </w:rPr>
-              <w:jc w:val="center"/>
-            </w:pPr>
-            <w:r>
-              <w:rPr>
-                <w:rFonts w:hint="eastAsia" w:ascii="宋体" w:hAnsi="宋体" w:eastAsia="宋体" w:cs="宋体"/>
-                <w:sz w:val="24"/>
-                <w:highlight w:val="none"/>
-                <w:lang w:eastAsia="zh-CN"/>
-              </w:rPr>
-              <w:t>小键盘区（绿）　指示灯区（紫）</w:t>
-            </w:r>
-          </w:p>
-          <w:p>
-            <w:pPr>
-              <w:keepNext w:val="0"/>
-              <w:keepLines w:val="0"/>
-              <w:suppressLineNumbers w:val="0"/>
-              <w:spacing w:before="0" w:beforeAutospacing="0" w:after="0" w:afterAutospacing="0" w:line="240" w:lineRule="auto"/>
-              <w:ind w:left="0" w:right="0"/>
-              <w:rPr>
-                <w:rFonts w:hint="eastAsia" w:ascii="宋体" w:hAnsi="宋体" w:eastAsia="宋体" w:cs="宋体"/>
-                <w:sz w:val="24"/>
-                <w:highlight w:val="none"/>
-                <w:lang w:eastAsia="zh-CN"/>
-              </w:rPr>
-              <w:jc w:val="center"/>
-            </w:pPr>
-            <w:r>
-              <w:rPr>
-                <w:rFonts w:hint="eastAsia" w:ascii="宋体" w:hAnsi="宋体" w:eastAsia="宋体" w:cs="宋体"/>
-                <w:sz w:val="24"/>
-                <w:highlight w:val="none"/>
-                <w:lang w:eastAsia="zh-CN"/>
-              </w:rPr>
-              <w:t>主键盘区：输入字母和数字</w:t>
-            </w:r>
-          </w:p>
-          <w:p>
-            <w:pPr>
-              <w:keepNext w:val="0"/>
-              <w:keepLines w:val="0"/>
-              <w:suppressLineNumbers w:val="0"/>
-              <w:spacing w:before="0" w:beforeAutospacing="0" w:after="0" w:afterAutospacing="0" w:line="240" w:lineRule="auto"/>
-              <w:ind w:left="0" w:right="0"/>
-              <w:rPr>
-                <w:rFonts w:hint="eastAsia" w:ascii="宋体" w:hAnsi="宋体" w:eastAsia="宋体" w:cs="宋体"/>
-                <w:sz w:val="24"/>
-                <w:highlight w:val="none"/>
-                <w:lang w:eastAsia="zh-CN"/>
-              </w:rPr>
-              <w:jc w:val="center"/>
-            </w:pPr>
-            <w:r>
-              <w:rPr>
-                <w:rFonts w:hint="eastAsia" w:ascii="宋体" w:hAnsi="宋体" w:eastAsia="宋体" w:cs="宋体"/>
-                <w:sz w:val="24"/>
-                <w:highlight w:val="none"/>
-                <w:lang w:eastAsia="zh-CN"/>
-              </w:rPr>
-              <w:t>先尝试 → 听讲解 → 再修正 → 多练习</w:t>
-            </w:r>
+            </w:pPr>
           </w:p>
         </w:tc>
       </w:tr>
@@ -5320,10 +5372,8 @@
                 <w:highlight w:val="none"/>
               </w:rPr>
             </w:pPr>
-            <w:r>
-              <w:rPr/>
-              <w:t>（课后填写）</w:t>
-            </w:r>
+            <w:bookmarkStart w:id="0" w:name="_GoBack"/>
+            <w:bookmarkEnd w:id="0"/>
           </w:p>
           <w:p>
             <w:pPr>
@@ -5338,10 +5388,6 @@
                 <w:highlight w:val="none"/>
               </w:rPr>
             </w:pPr>
-            <w:r>
-              <w:rPr/>
-              <w:t/>
-            </w:r>
           </w:p>
           <w:p>
             <w:pPr>
@@ -5356,28 +5402,6 @@
                 <w:highlight w:val="none"/>
               </w:rPr>
             </w:pPr>
-            <w:r>
-              <w:rPr/>
-              <w:t/>
-            </w:r>
-          </w:p>
-          <w:p>
-            <w:pPr>
-              <w:keepNext w:val="0"/>
-              <w:keepLines w:val="0"/>
-              <w:suppressLineNumbers w:val="0"/>
-              <w:spacing w:before="0" w:beforeAutospacing="0" w:after="0" w:afterAutospacing="0" w:line="240" w:lineRule="auto"/>
-              <w:ind w:left="0" w:right="0"/>
-              <w:rPr>
-                <w:rFonts w:hint="eastAsia" w:ascii="宋体" w:hAnsi="宋体" w:eastAsia="宋体" w:cs="宋体"/>
-                <w:szCs w:val="21"/>
-                <w:highlight w:val="none"/>
-              </w:rPr>
-            </w:pPr>
-            <w:r>
-              <w:rPr/>
-              <w:t/>
-            </w:r>
           </w:p>
         </w:tc>
       </w:tr>
@@ -5386,13 +5410,13 @@
       <w:pPr>
         <w:pStyle w:val="11"/>
         <w:widowControl/>
+        <w:spacing w:line="20" w:lineRule="exact"/>
         <w:jc w:val="both"/>
         <w:rPr>
           <w:rFonts w:ascii="华文中宋" w:hAnsi="华文中宋" w:eastAsia="华文中宋" w:cs="华文中宋"/>
           <w:sz w:val="28"/>
           <w:szCs w:val="36"/>
         </w:rPr>
-        <w:spacing w:line="20" w:lineRule="exact"/>
       </w:pPr>
     </w:p>
     <w:sectPr>

</xml_diff>

<commit_message>
docs: name five mouse skills in lesson stages; drop classroom-count tip
Spell out 指向、拖动、单击、双击、右击 in review/import stage copy across the flow HTML, lesson plan docx, README, and reference notes. Name 单击/拖动 in the coloring demo step. Remove the hover tip line “按本课堂 N 位参与学生计算” from classroom pages.
</commit_message>
<xml_diff>
--- a/邱梓钊 三年级《认识键盘》教学设计.docx
+++ b/邱梓钊 三年级《认识键盘》教学设计.docx
@@ -1512,7 +1512,7 @@
                 <w:highlight w:val="none"/>
                 <w:lang w:val="en-US" w:eastAsia="zh-CN"/>
               </w:rPr>
-              <w:t>1. 教师提问：“前面的课上，我们学习了鼠标的五种基本操作，谁还记得有哪些？”学生简短回顾，教师依据已学内容补充。</w:t>
+              <w:t>1. 教师提问：“前面的课上，我们学习了鼠标的五种用法：指向、拖动、单击、双击、右击，谁还记得分别是怎么用的？”学生简短回顾，教师依据已学内容补充。</w:t>
             </w:r>
           </w:p>
           <w:p>
@@ -1627,7 +1627,7 @@
                 <w:szCs w:val="22"/>
                 <w:shd w:val="clear" w:fill="FFFFFF"/>
               </w:rPr>
-              <w:t>能回忆已学鼠标操作，知道键盘也是输入设备，明确本课学习对象。</w:t>
+              <w:t>能回忆鼠标五种用法（指向、拖动、单击、双击、右击），知道键盘也是输入设备，明确本课学习对象。</w:t>
             </w:r>
           </w:p>
         </w:tc>
@@ -1973,7 +1973,7 @@
                 <w:highlight w:val="none"/>
                 <w:lang w:val="en-US" w:eastAsia="zh-CN"/>
               </w:rPr>
-              <w:t>2. 示范选颜色、点击或按住鼠标涂色、换色修改的方法，暂不公布正确分区。</w:t>
+              <w:t>2. 示范选颜色、单击填色（也可按住拖动连续涂色）、换色修改的方法，暂不公布正确分区。</w:t>
             </w:r>
           </w:p>
           <w:p>

</xml_diff>

<commit_message>
docs: drop closing share-and-feedback step from lesson wrap-up
Remove the final “找键发现 / 填色前后反馈” item from the Word plan,
HTML flow, and README; renumber the closing summary and keep the
review questions coherent.
</commit_message>
<xml_diff>
--- a/邱梓钊 三年级《认识键盘》教学设计.docx
+++ b/邱梓钊 三年级《认识键盘》教学设计.docx
@@ -4554,8 +4554,29 @@
                 <w:lang w:val="en-US" w:eastAsia="zh-CN"/>
               </w:rPr>
               <w:t>1. 学生停下操作，简短回答：“键盘可以分成哪五个区域？”“今天输入字母和数字主要使用了哪里？”</w:t>
-            </w:r>
-          </w:p>
+              <w:br/>
+              <w:t>2. 总结：今天认识了键盘五区，并用主键盘区输入字母和数字；继续练习会更熟悉按键位置。</w:t>
+            </w:r>
+          </w:p>
+        </w:tc>
+        <w:tc>
+          <w:tcPr>
+            <w:tcW w:w="2327" w:type="dxa"/>
+            <w:tcBorders>
+              <w:top w:val="single" w:color="auto" w:sz="2" w:space="0"/>
+              <w:left w:val="single" w:color="auto" w:sz="2" w:space="0"/>
+              <w:bottom w:val="single" w:color="auto" w:sz="2" w:space="0"/>
+              <w:right w:val="single" w:color="auto" w:sz="2" w:space="0"/>
+              <w:tl2br w:val="nil"/>
+              <w:tr2bl w:val="nil"/>
+            </w:tcBorders>
+            <w:tcMar>
+              <w:top w:w="55" w:type="dxa"/>
+              <w:left w:w="65" w:type="dxa"/>
+              <w:bottom w:w="55" w:type="dxa"/>
+              <w:right w:w="65" w:type="dxa"/>
+            </w:tcMar>
+          </w:tcPr>
           <w:p>
             <w:pPr>
               <w:keepNext/>
@@ -4566,87 +4587,6 @@
               </w:numPr>
               <w:suppressLineNumbers w:val="0"/>
               <w:spacing w:before="0" w:beforeAutospacing="0" w:after="0" w:afterAutospacing="0" w:line="240" w:lineRule="auto"/>
-              <w:ind w:left="0" w:right="0"/>
-              <w:jc w:val="both"/>
-              <w:rPr>
-                <w:rFonts w:hint="eastAsia" w:ascii="宋体" w:hAnsi="宋体" w:eastAsia="宋体" w:cs="宋体"/>
-                <w:sz w:val="22"/>
-                <w:szCs w:val="28"/>
-                <w:highlight w:val="none"/>
-                <w:lang w:val="en-US" w:eastAsia="zh-CN"/>
-              </w:rPr>
-            </w:pPr>
-            <w:r>
-              <w:rPr>
-                <w:rFonts w:hint="eastAsia" w:ascii="宋体" w:hAnsi="宋体" w:eastAsia="宋体" w:cs="宋体"/>
-                <w:sz w:val="22"/>
-                <w:szCs w:val="28"/>
-                <w:highlight w:val="none"/>
-                <w:lang w:val="en-US" w:eastAsia="zh-CN"/>
-              </w:rPr>
-              <w:t>2. 邀请学生分享一个找键发现，教师结合填色前后变化和练习情况给予具体反馈。</w:t>
-            </w:r>
-          </w:p>
-          <w:p>
-            <w:pPr>
-              <w:keepNext/>
-              <w:keepLines w:val="0"/>
-              <w:numPr>
-                <w:ilvl w:val="0"/>
-                <w:numId w:val="0"/>
-              </w:numPr>
-              <w:suppressLineNumbers w:val="0"/>
-              <w:spacing w:before="0" w:beforeAutospacing="0" w:after="0" w:afterAutospacing="0" w:line="240" w:lineRule="auto"/>
-              <w:ind w:left="0" w:right="0"/>
-              <w:jc w:val="both"/>
-              <w:rPr>
-                <w:rFonts w:hint="eastAsia" w:ascii="宋体" w:hAnsi="宋体" w:eastAsia="宋体" w:cs="宋体"/>
-                <w:sz w:val="22"/>
-                <w:szCs w:val="28"/>
-                <w:highlight w:val="none"/>
-                <w:lang w:val="en-US" w:eastAsia="zh-CN"/>
-              </w:rPr>
-            </w:pPr>
-            <w:r>
-              <w:rPr>
-                <w:rFonts w:hint="eastAsia" w:ascii="宋体" w:hAnsi="宋体" w:eastAsia="宋体" w:cs="宋体"/>
-                <w:sz w:val="22"/>
-                <w:szCs w:val="28"/>
-                <w:highlight w:val="none"/>
-                <w:lang w:val="en-US" w:eastAsia="zh-CN"/>
-              </w:rPr>
-              <w:t>3. 总结：今天认识了键盘五区，并用主键盘区输入字母和数字；继续练习会更熟悉按键位置。</w:t>
-            </w:r>
-          </w:p>
-        </w:tc>
-        <w:tc>
-          <w:tcPr>
-            <w:tcW w:w="2327" w:type="dxa"/>
-            <w:tcBorders>
-              <w:top w:val="single" w:color="auto" w:sz="2" w:space="0"/>
-              <w:left w:val="single" w:color="auto" w:sz="2" w:space="0"/>
-              <w:bottom w:val="single" w:color="auto" w:sz="2" w:space="0"/>
-              <w:right w:val="single" w:color="auto" w:sz="2" w:space="0"/>
-              <w:tl2br w:val="nil"/>
-              <w:tr2bl w:val="nil"/>
-            </w:tcBorders>
-            <w:tcMar>
-              <w:top w:w="55" w:type="dxa"/>
-              <w:left w:w="65" w:type="dxa"/>
-              <w:bottom w:w="55" w:type="dxa"/>
-              <w:right w:w="65" w:type="dxa"/>
-            </w:tcMar>
-          </w:tcPr>
-          <w:p>
-            <w:pPr>
-              <w:keepNext/>
-              <w:keepLines w:val="0"/>
-              <w:numPr>
-                <w:ilvl w:val="0"/>
-                <w:numId w:val="0"/>
-              </w:numPr>
-              <w:suppressLineNumbers w:val="0"/>
-              <w:spacing w:before="0" w:beforeAutospacing="0" w:after="0" w:afterAutospacing="0" w:line="240" w:lineRule="auto"/>
               <w:ind w:left="0" w:leftChars="0" w:right="0" w:rightChars="0"/>
               <w:jc w:val="both"/>
               <w:rPr>
@@ -4668,7 +4608,7 @@
                 <w:szCs w:val="22"/>
                 <w:shd w:val="clear" w:fill="FFFFFF"/>
               </w:rPr>
-              <w:t>能说出五区名称及主键盘区用途，表达一项练习收获。结合指认和输入表现检查目标达成。</w:t>
+              <w:t>能说出五区名称及主键盘区用途。结合指认和输入表现检查目标达成。</w:t>
             </w:r>
           </w:p>
         </w:tc>

</xml_diff>

<commit_message>
docs: drop numpad-vs-main-keyboard number reminder from stage 4
</commit_message>
<xml_diff>
--- a/邱梓钊 三年级《认识键盘》教学设计.docx
+++ b/邱梓钊 三年级《认识键盘》教学设计.docx
@@ -2836,6 +2836,25 @@
               <w:t>2. 逐区指认并简讲：主键盘区在中间较大区域，用于输入字母、数字等；功能键区在上方，提供功能操作；编辑键区用于移动光标、翻页和编辑；小键盘区通常在最右侧，便于集中输入数字；指示灯区显示键盘状态。学生同步在实物上找一找。</w:t>
             </w:r>
           </w:p>
+        </w:tc>
+        <w:tc>
+          <w:tcPr>
+            <w:tcW w:w="2327" w:type="dxa"/>
+            <w:tcBorders>
+              <w:top w:val="single" w:color="auto" w:sz="2" w:space="0"/>
+              <w:left w:val="single" w:color="auto" w:sz="2" w:space="0"/>
+              <w:bottom w:val="single" w:color="auto" w:sz="2" w:space="0"/>
+              <w:right w:val="single" w:color="auto" w:sz="2" w:space="0"/>
+              <w:tl2br w:val="nil"/>
+              <w:tr2bl w:val="nil"/>
+            </w:tcBorders>
+            <w:tcMar>
+              <w:top w:w="55" w:type="dxa"/>
+              <w:left w:w="65" w:type="dxa"/>
+              <w:bottom w:w="55" w:type="dxa"/>
+              <w:right w:w="65" w:type="dxa"/>
+            </w:tcMar>
+          </w:tcPr>
           <w:p>
             <w:pPr>
               <w:keepNext/>
@@ -2846,56 +2865,6 @@
               </w:numPr>
               <w:suppressLineNumbers w:val="0"/>
               <w:spacing w:before="0" w:beforeAutospacing="0" w:after="0" w:afterAutospacing="0" w:line="240" w:lineRule="auto"/>
-              <w:ind w:left="0" w:right="0"/>
-              <w:jc w:val="both"/>
-              <w:rPr>
-                <w:rFonts w:hint="eastAsia" w:ascii="宋体" w:hAnsi="宋体" w:eastAsia="宋体" w:cs="宋体"/>
-                <w:sz w:val="22"/>
-                <w:szCs w:val="28"/>
-                <w:highlight w:val="none"/>
-                <w:lang w:val="en-US" w:eastAsia="zh-CN"/>
-              </w:rPr>
-            </w:pPr>
-            <w:r>
-              <w:rPr>
-                <w:rFonts w:hint="eastAsia" w:ascii="宋体" w:hAnsi="宋体" w:eastAsia="宋体" w:cs="宋体"/>
-                <w:sz w:val="22"/>
-                <w:szCs w:val="28"/>
-                <w:highlight w:val="none"/>
-                <w:lang w:val="en-US" w:eastAsia="zh-CN"/>
-              </w:rPr>
-              <w:t>3. 提醒主键盘区和小键盘区都有数字，本课使用主键盘区的数字。</w:t>
-            </w:r>
-          </w:p>
-        </w:tc>
-        <w:tc>
-          <w:tcPr>
-            <w:tcW w:w="2327" w:type="dxa"/>
-            <w:tcBorders>
-              <w:top w:val="single" w:color="auto" w:sz="2" w:space="0"/>
-              <w:left w:val="single" w:color="auto" w:sz="2" w:space="0"/>
-              <w:bottom w:val="single" w:color="auto" w:sz="2" w:space="0"/>
-              <w:right w:val="single" w:color="auto" w:sz="2" w:space="0"/>
-              <w:tl2br w:val="nil"/>
-              <w:tr2bl w:val="nil"/>
-            </w:tcBorders>
-            <w:tcMar>
-              <w:top w:w="55" w:type="dxa"/>
-              <w:left w:w="65" w:type="dxa"/>
-              <w:bottom w:w="55" w:type="dxa"/>
-              <w:right w:w="65" w:type="dxa"/>
-            </w:tcMar>
-          </w:tcPr>
-          <w:p>
-            <w:pPr>
-              <w:keepNext/>
-              <w:keepLines w:val="0"/>
-              <w:numPr>
-                <w:ilvl w:val="0"/>
-                <w:numId w:val="0"/>
-              </w:numPr>
-              <w:suppressLineNumbers w:val="0"/>
-              <w:spacing w:before="0" w:beforeAutospacing="0" w:after="0" w:afterAutospacing="0" w:line="240" w:lineRule="auto"/>
               <w:ind w:left="0" w:leftChars="0" w:right="0" w:rightChars="0"/>
               <w:jc w:val="both"/>
               <w:rPr>
@@ -2906,18 +2875,7 @@
               </w:rPr>
             </w:pPr>
             <w:r>
-              <w:rPr>
-                <w:rFonts w:hint="eastAsia" w:ascii="宋体" w:hAnsi="宋体" w:eastAsia="宋体" w:cs="宋体"/>
-                <w:i w:val="0"/>
-                <w:iCs w:val="0"/>
-                <w:caps w:val="0"/>
-                <w:color w:val="000000"/>
-                <w:spacing w:val="0"/>
-                <w:sz w:val="22"/>
-                <w:szCs w:val="22"/>
-                <w:shd w:val="clear" w:fill="FFFFFF"/>
-              </w:rPr>
-              <w:t>能对照分区图找到五个区域，初步说出用途；能区分两处数字键。</w:t>
+              <w:t>能对照分区图找到五个区域，初步说出用途。</w:t>
             </w:r>
           </w:p>
         </w:tc>

</xml_diff>